<commit_message>
Use the official ZB logos on the site and guides
Replace the redrawn SVG mark with the supplied logo images: the green
mark on light backgrounds and the green tile on dark ones. Swap the
favicon to match and rebuild the PDF and Word guides.

Co-Authored-By: Claude Opus 5.5 <noreply@anthropic.com>
</commit_message>
<xml_diff>
--- a/docs/ZB-Vault-Platform-Guide.docx
+++ b/docs/ZB-Vault-Platform-Guide.docx
@@ -47,7 +47,7 @@
             <w:r>
               <w:drawing>
                 <wp:inline distT="0" distB="0" distL="0" distR="0">
-                  <wp:extent cx="495300" cy="495300"/>
+                  <wp:extent cx="533400" cy="495300"/>
                   <wp:effectExtent t="0" r="0" b="0" l="0"/>
                   <wp:docPr id="1" name="" descr="" title=""/>
                   <wp:cNvGraphicFramePr>
@@ -72,7 +72,7 @@
                         <pic:spPr bwMode="auto">
                           <a:xfrm>
                             <a:off x="0" y="0"/>
-                            <a:ext cx="495300" cy="495300"/>
+                            <a:ext cx="533400" cy="495300"/>
                           </a:xfrm>
                           <a:prstGeom prst="rect">
                             <a:avLst/>
@@ -5961,7 +5961,7 @@
     <w:r>
       <w:drawing>
         <wp:inline distT="0" distB="0" distL="0" distR="0">
-          <wp:extent cx="152400" cy="152400"/>
+          <wp:extent cx="142875" cy="161925"/>
           <wp:effectExtent t="0" r="0" b="0" l="0"/>
           <wp:docPr id="12" name="" descr="" title=""/>
           <wp:cNvGraphicFramePr>
@@ -5986,7 +5986,7 @@
                 <pic:spPr bwMode="auto">
                   <a:xfrm>
                     <a:off x="0" y="0"/>
-                    <a:ext cx="152400" cy="152400"/>
+                    <a:ext cx="142875" cy="161925"/>
                   </a:xfrm>
                   <a:prstGeom prst="rect">
                     <a:avLst/>

</xml_diff>